<commit_message>
Verification: fix 6% indexing claim, real query clustering (492 of 535), 3-month plan page, Topvisor package
</commit_message>
<xml_diff>
--- a/CLIENT_REPORT.docx
+++ b/CLIENT_REPORT.docx
@@ -817,294 +817,101 @@
         <w:rPr>
           <w:color w:val="111827"/>
         </w:rPr>
-        <w:t>5. Коэффициент индексации каталога — 6%</w:t>
+        <w:t>5. Индексация: каталог в порядке, мёртвые разделы тянут вниз</w:t>
       </w:r>
     </w:p>
-    <w:tbl>
-      <w:tblPr>
-        <w:tblStyle w:val="LightGrid-Accent1"/>
-        <w:tblW w:type="auto" w:w="0"/>
-        <w:tblLook w:firstColumn="1" w:firstRow="1" w:lastColumn="0" w:lastRow="0" w:noHBand="0" w:noVBand="1" w:val="04A0"/>
-      </w:tblPr>
-      <w:tblGrid>
-        <w:gridCol w:w="2160"/>
-        <w:gridCol w:w="2160"/>
-        <w:gridCol w:w="2160"/>
-        <w:gridCol w:w="2160"/>
-      </w:tblGrid>
-      <w:tr>
-        <w:tc>
-          <w:tcPr>
-            <w:tcW w:type="dxa" w:w="2160"/>
-          </w:tcPr>
-          <w:p>
-            <w:r/>
-            <w:r>
-              <w:rPr>
-                <w:b/>
-              </w:rPr>
-              <w:t>Раздел</w:t>
-            </w:r>
-          </w:p>
-        </w:tc>
-        <w:tc>
-          <w:tcPr>
-            <w:tcW w:type="dxa" w:w="2160"/>
-          </w:tcPr>
-          <w:p>
-            <w:r/>
-            <w:r>
-              <w:rPr>
-                <w:b/>
-              </w:rPr>
-              <w:t>В индексе</w:t>
-            </w:r>
-          </w:p>
-        </w:tc>
-        <w:tc>
-          <w:tcPr>
-            <w:tcW w:type="dxa" w:w="2160"/>
-          </w:tcPr>
-          <w:p>
-            <w:r/>
-            <w:r>
-              <w:rPr>
-                <w:b/>
-              </w:rPr>
-              <w:t>В поиске</w:t>
-            </w:r>
-          </w:p>
-        </w:tc>
-        <w:tc>
-          <w:tcPr>
-            <w:tcW w:type="dxa" w:w="2160"/>
-          </w:tcPr>
-          <w:p>
-            <w:r/>
-            <w:r>
-              <w:rPr>
-                <w:b/>
-              </w:rPr>
-              <w:t>%</w:t>
-            </w:r>
-          </w:p>
-        </w:tc>
-      </w:tr>
-      <w:tr>
-        <w:tc>
-          <w:tcPr>
-            <w:tcW w:type="dxa" w:w="2160"/>
-          </w:tcPr>
-          <w:p>
-            <w:r>
-              <w:t>/catalog</w:t>
-            </w:r>
-          </w:p>
-        </w:tc>
-        <w:tc>
-          <w:tcPr>
-            <w:tcW w:type="dxa" w:w="2160"/>
-          </w:tcPr>
-          <w:p>
-            <w:r>
-              <w:t>831</w:t>
-            </w:r>
-          </w:p>
-        </w:tc>
-        <w:tc>
-          <w:tcPr>
-            <w:tcW w:type="dxa" w:w="2160"/>
-          </w:tcPr>
-          <w:p>
-            <w:r>
-              <w:t>51</w:t>
-            </w:r>
-          </w:p>
-        </w:tc>
-        <w:tc>
-          <w:tcPr>
-            <w:tcW w:type="dxa" w:w="2160"/>
-          </w:tcPr>
-          <w:p>
-            <w:r>
-              <w:t>6.1%</w:t>
-            </w:r>
-          </w:p>
-        </w:tc>
-      </w:tr>
-      <w:tr>
-        <w:tc>
-          <w:tcPr>
-            <w:tcW w:type="dxa" w:w="2160"/>
-          </w:tcPr>
-          <w:p>
-            <w:r>
-              <w:t>/poligrafiya</w:t>
-            </w:r>
-          </w:p>
-        </w:tc>
-        <w:tc>
-          <w:tcPr>
-            <w:tcW w:type="dxa" w:w="2160"/>
-          </w:tcPr>
-          <w:p>
-            <w:r>
-              <w:t>342</w:t>
-            </w:r>
-          </w:p>
-        </w:tc>
-        <w:tc>
-          <w:tcPr>
-            <w:tcW w:type="dxa" w:w="2160"/>
-          </w:tcPr>
-          <w:p>
-            <w:r>
-              <w:t>21</w:t>
-            </w:r>
-          </w:p>
-        </w:tc>
-        <w:tc>
-          <w:tcPr>
-            <w:tcW w:type="dxa" w:w="2160"/>
-          </w:tcPr>
-          <w:p>
-            <w:r>
-              <w:t>6.1%</w:t>
-            </w:r>
-          </w:p>
-        </w:tc>
-      </w:tr>
-      <w:tr>
-        <w:tc>
-          <w:tcPr>
-            <w:tcW w:type="dxa" w:w="2160"/>
-          </w:tcPr>
-          <w:p>
-            <w:r>
-              <w:t>/suvenirnaya-produktsiya</w:t>
-            </w:r>
-          </w:p>
-        </w:tc>
-        <w:tc>
-          <w:tcPr>
-            <w:tcW w:type="dxa" w:w="2160"/>
-          </w:tcPr>
-          <w:p>
-            <w:r>
-              <w:t>340</w:t>
-            </w:r>
-          </w:p>
-        </w:tc>
-        <w:tc>
-          <w:tcPr>
-            <w:tcW w:type="dxa" w:w="2160"/>
-          </w:tcPr>
-          <w:p>
-            <w:r>
-              <w:t>21</w:t>
-            </w:r>
-          </w:p>
-        </w:tc>
-        <w:tc>
-          <w:tcPr>
-            <w:tcW w:type="dxa" w:w="2160"/>
-          </w:tcPr>
-          <w:p>
-            <w:r>
-              <w:t>6.2%</w:t>
-            </w:r>
-          </w:p>
-        </w:tc>
-      </w:tr>
-      <w:tr>
-        <w:tc>
-          <w:tcPr>
-            <w:tcW w:type="dxa" w:w="2160"/>
-          </w:tcPr>
-          <w:p>
-            <w:r>
-              <w:t>/inzhenernaya-pechat</w:t>
-            </w:r>
-          </w:p>
-        </w:tc>
-        <w:tc>
-          <w:tcPr>
-            <w:tcW w:type="dxa" w:w="2160"/>
-          </w:tcPr>
-          <w:p>
-            <w:r>
-              <w:t>28</w:t>
-            </w:r>
-          </w:p>
-        </w:tc>
-        <w:tc>
-          <w:tcPr>
-            <w:tcW w:type="dxa" w:w="2160"/>
-          </w:tcPr>
-          <w:p>
-            <w:r>
-              <w:t>2</w:t>
-            </w:r>
-          </w:p>
-        </w:tc>
-        <w:tc>
-          <w:tcPr>
-            <w:tcW w:type="dxa" w:w="2160"/>
-          </w:tcPr>
-          <w:p>
-            <w:r>
-              <w:t>7.1%</w:t>
-            </w:r>
-          </w:p>
-        </w:tc>
-      </w:tr>
-      <w:tr>
-        <w:tc>
-          <w:tcPr>
-            <w:tcW w:type="dxa" w:w="2160"/>
-          </w:tcPr>
-          <w:p>
-            <w:r>
-              <w:t>/mobilnye-stendy</w:t>
-            </w:r>
-          </w:p>
-        </w:tc>
-        <w:tc>
-          <w:tcPr>
-            <w:tcW w:type="dxa" w:w="2160"/>
-          </w:tcPr>
-          <w:p>
-            <w:r>
-              <w:t>16</w:t>
-            </w:r>
-          </w:p>
-        </w:tc>
-        <w:tc>
-          <w:tcPr>
-            <w:tcW w:type="dxa" w:w="2160"/>
-          </w:tcPr>
-          <w:p>
-            <w:r>
-              <w:t>1</w:t>
-            </w:r>
-          </w:p>
-        </w:tc>
-        <w:tc>
-          <w:tcPr>
-            <w:tcW w:type="dxa" w:w="2160"/>
-          </w:tcPr>
-          <w:p>
-            <w:r>
-              <w:t>6.3%</w:t>
-            </w:r>
-          </w:p>
-        </w:tc>
-      </w:tr>
-    </w:tbl>
-    <w:p/>
     <w:p>
       <w:r>
-        <w:t>Норма: 60%+. Причина: дубли, PARSE_ERROR, отсутствие canonical, битые внутренние ссылки.</w:t>
+        <w:t>['| Раздел | URL в выборке | В поиске | Доля | Дубли | Ошибки |', '|---|---|---|---|---|---|', '| Каталог | 224 | 134 | 59.8% | 62 | 1 |', '| Магазин (legacy /shop/) | 314 | 0 | 0.0% | 4 | 236 |', '| Легаси .html | 129 | 0 | 0.0% | 60 | 36 |', '| Прочие страницы | 16 | 4 | 25.0% | 1 | 10 |', '| Новости | 1 | 1 | 100.0% | 0 | 0 |', '| Личный кабинет | 2 | 2 | 100.0% | 0 | 0 |', '| Главная | 1 | 1 | 100.0% | 0 | 0 |', '| Итого | 717 | 142 | 19.8% | 128 | 286 |']</w:t>
+      </w:r>
+    </w:p>
+    <w:p>
+      <w:r>
+        <w:t>Как читать: каталог, который и приносит трафик, в поиске примерно на</w:t>
+      </w:r>
+    </w:p>
+    <w:p>
+      <w:r>
+        <w:t>60%: из 224 проверенных URL каталога в поиске</w:t>
+      </w:r>
+    </w:p>
+    <w:p>
+      <w:r>
+        <w:t>134, это нормальный показатель. Общий процент</w:t>
+      </w:r>
+    </w:p>
+    <w:p>
+      <w:r>
+        <w:t>19.8% получается из-за двух мёртвых зон:</w:t>
+      </w:r>
+    </w:p>
+    <w:p>
+      <w:pPr>
+        <w:pStyle w:val="ListBullet"/>
+      </w:pPr>
+      <w:r>
+        <w:t>`/shop` — 314 URL, в поиске 0, ошибок парсинга</w:t>
+      </w:r>
+    </w:p>
+    <w:p>
+      <w:pPr>
+        <w:pStyle w:val="ListNumber"/>
+      </w:pPr>
+      <w:r>
+        <w:t>Раздел не обслуживается, но продолжает отдавать коды роботу.</w:t>
+      </w:r>
+    </w:p>
+    <w:p>
+      <w:pPr>
+        <w:pStyle w:val="ListBullet"/>
+      </w:pPr>
+      <w:r>
+        <w:t>Легаси `.html` — около 129 URL старой вёрстки, почти все в статусе</w:t>
+      </w:r>
+    </w:p>
+    <w:p>
+      <w:r>
+        <w:t>дублей или с ошибкой разбора.</w:t>
+      </w:r>
+    </w:p>
+    <w:p>
+      <w:r>
+        <w:t>Структура из панели подтверждает вывод: на дату выгрузки в каталоге было</w:t>
+      </w:r>
+    </w:p>
+    <w:p>
+      <w:r>
+        <w:t>831 проиндексированных и 565 в поиске,</w:t>
+      </w:r>
+    </w:p>
+    <w:p>
+      <w:r>
+        <w:t>в /shop — 388 проиндексированных и</w:t>
+      </w:r>
+    </w:p>
+    <w:p>
+      <w:r>
+        <w:t>0 в поиске.</w:t>
+      </w:r>
+    </w:p>
+    <w:p>
+      <w:r>
+        <w:t>Что это меняет в плане: приоритет первый месяца не «улучшить индексацию</w:t>
+      </w:r>
+    </w:p>
+    <w:p>
+      <w:r>
+        <w:t>каталога», а закрыть /shop и легаси .html (редиректы в каталог или 410) и</w:t>
+      </w:r>
+    </w:p>
+    <w:p>
+      <w:r>
+        <w:t>снять с них robots. После этого общий показатель индексации поднимется</w:t>
+      </w:r>
+    </w:p>
+    <w:p>
+      <w:r>
+        <w:t>минимум до 60% без единой новой страницы.</w:t>
       </w:r>
     </w:p>
     <w:p>
@@ -1120,7 +927,27 @@
         <w:rPr>
           <w:color w:val="1F6FEB"/>
         </w:rPr>
-        <w:t>📊 Семантическое ядро (535 запросов, 7 дней мониторинга)</w:t>
+        <w:t>📊 Семантическое ядро (492 запросов, 7 дней мониторинга)</w:t>
+      </w:r>
+    </w:p>
+    <w:p>
+      <w:r>
+        <w:t>Из 535 строк выгрузки панели 43 оказались мусором: телефоны и длинные</w:t>
+      </w:r>
+    </w:p>
+    <w:p>
+      <w:r>
+        <w:t>описания товаров. Реальных запросов 492, из них коммерческих 139,</w:t>
+      </w:r>
+    </w:p>
+    <w:p>
+      <w:r>
+        <w:t>локальных 171, брендовых 38, информационных и прочих 143.</w:t>
+      </w:r>
+    </w:p>
+    <w:p>
+      <w:r>
+        <w:t>Целевая страница определена у 177 запросов, у остальных её нет вообще.</w:t>
       </w:r>
     </w:p>
     <w:p>
@@ -1145,7 +972,7 @@
         <w:t>ТОП-1:</w:t>
       </w:r>
       <w:r>
-        <w:t xml:space="preserve"> 12 запросов (брендовые)</w:t>
+        <w:t xml:space="preserve"> 12 запросов (2%)</w:t>
       </w:r>
     </w:p>
     <w:p>
@@ -1159,7 +986,7 @@
         <w:t>ТОП-3:</w:t>
       </w:r>
       <w:r>
-        <w:t xml:space="preserve"> 55 запросов</w:t>
+        <w:t xml:space="preserve"> 55 запросов (10%)</w:t>
       </w:r>
     </w:p>
     <w:p>
@@ -1174,20 +1001,6 @@
       </w:r>
       <w:r>
         <w:t xml:space="preserve"> 390 запросов (73%)</w:t>
-      </w:r>
-    </w:p>
-    <w:p>
-      <w:pPr>
-        <w:pStyle w:val="ListBullet"/>
-      </w:pPr>
-      <w:r>
-        <w:rPr>
-          <w:b/>
-        </w:rPr>
-        <w:t>ТОП-20:</w:t>
-      </w:r>
-      <w:r>
-        <w:t xml:space="preserve"> 495 запросов</w:t>
       </w:r>
     </w:p>
     <w:p>
@@ -1267,7 +1080,7 @@
               <w:rPr>
                 <w:b/>
               </w:rPr>
-              <w:t>Страниц на сайте</w:t>
+              <w:t>В ТОП-10</w:t>
             </w:r>
           </w:p>
         </w:tc>
@@ -1281,7 +1094,7 @@
               <w:rPr>
                 <w:b/>
               </w:rPr>
-              <w:t>Покрытие</w:t>
+              <w:t>Целевая страница</w:t>
             </w:r>
           </w:p>
         </w:tc>
@@ -1303,7 +1116,7 @@
           </w:tcPr>
           <w:p>
             <w:r>
-              <w:t>35</w:t>
+              <w:t>32</w:t>
             </w:r>
           </w:p>
         </w:tc>
@@ -1313,7 +1126,7 @@
           </w:tcPr>
           <w:p>
             <w:r>
-              <w:t>3.8</w:t>
+              <w:t>6.1</w:t>
             </w:r>
           </w:p>
         </w:tc>
@@ -1323,7 +1136,7 @@
           </w:tcPr>
           <w:p>
             <w:r>
-              <w:t>8</w:t>
+              <w:t>91%</w:t>
             </w:r>
           </w:p>
         </w:tc>
@@ -1333,7 +1146,7 @@
           </w:tcPr>
           <w:p>
             <w:r>
-              <w:t>40%</w:t>
+              <w:t>/catalog/poligrafiya/vizitki/</w:t>
             </w:r>
           </w:p>
         </w:tc>
@@ -1345,7 +1158,7 @@
           </w:tcPr>
           <w:p>
             <w:r>
-              <w:t>Кружки/Магниты</w:t>
+              <w:t>Кружки и магниты</w:t>
             </w:r>
           </w:p>
         </w:tc>
@@ -1355,7 +1168,7 @@
           </w:tcPr>
           <w:p>
             <w:r>
-              <w:t>28</w:t>
+              <w:t>27</w:t>
             </w:r>
           </w:p>
         </w:tc>
@@ -1365,7 +1178,7 @@
           </w:tcPr>
           <w:p>
             <w:r>
-              <w:t>6.2</w:t>
+              <w:t>8.3</w:t>
             </w:r>
           </w:p>
         </w:tc>
@@ -1375,7 +1188,7 @@
           </w:tcPr>
           <w:p>
             <w:r>
-              <w:t>6</w:t>
+              <w:t>85%</w:t>
             </w:r>
           </w:p>
         </w:tc>
@@ -1385,7 +1198,7 @@
           </w:tcPr>
           <w:p>
             <w:r>
-              <w:t>33%</w:t>
+              <w:t>/catalog/suvenirnaya-produktsiya/pechat-na-kruzhkakh</w:t>
             </w:r>
           </w:p>
         </w:tc>
@@ -1407,7 +1220,7 @@
           </w:tcPr>
           <w:p>
             <w:r>
-              <w:t>22</w:t>
+              <w:t>9</w:t>
             </w:r>
           </w:p>
         </w:tc>
@@ -1417,7 +1230,7 @@
           </w:tcPr>
           <w:p>
             <w:r>
-              <w:t>4.5</w:t>
+              <w:t>13.9</w:t>
             </w:r>
           </w:p>
         </w:tc>
@@ -1427,7 +1240,7 @@
           </w:tcPr>
           <w:p>
             <w:r>
-              <w:t>10</w:t>
+              <w:t>44%</w:t>
             </w:r>
           </w:p>
         </w:tc>
@@ -1437,7 +1250,7 @@
           </w:tcPr>
           <w:p>
             <w:r>
-              <w:t>67%</w:t>
+              <w:t>/catalog/poligrafiya/kalendari/</w:t>
             </w:r>
           </w:p>
         </w:tc>
@@ -1449,7 +1262,7 @@
           </w:tcPr>
           <w:p>
             <w:r>
-              <w:t>Листовки/Флаеры</w:t>
+              <w:t>Листовки и флаеры</w:t>
             </w:r>
           </w:p>
         </w:tc>
@@ -1459,7 +1272,7 @@
           </w:tcPr>
           <w:p>
             <w:r>
-              <w:t>18</w:t>
+              <w:t>6</w:t>
             </w:r>
           </w:p>
         </w:tc>
@@ -1469,7 +1282,7 @@
           </w:tcPr>
           <w:p>
             <w:r>
-              <w:t>6.8</w:t>
+              <w:t>7.3</w:t>
             </w:r>
           </w:p>
         </w:tc>
@@ -1479,7 +1292,7 @@
           </w:tcPr>
           <w:p>
             <w:r>
-              <w:t>5</w:t>
+              <w:t>83%</w:t>
             </w:r>
           </w:p>
         </w:tc>
@@ -1489,7 +1302,7 @@
           </w:tcPr>
           <w:p>
             <w:r>
-              <w:t>38%</w:t>
+              <w:t>/catalog/poligrafiya/listovki/</w:t>
             </w:r>
           </w:p>
         </w:tc>
@@ -1511,7 +1324,7 @@
           </w:tcPr>
           <w:p>
             <w:r>
-              <w:t>25</w:t>
+              <w:t>23</w:t>
             </w:r>
           </w:p>
         </w:tc>
@@ -1521,7 +1334,7 @@
           </w:tcPr>
           <w:p>
             <w:r>
-              <w:t>6.5</w:t>
+              <w:t>9.0</w:t>
             </w:r>
           </w:p>
         </w:tc>
@@ -1531,7 +1344,7 @@
           </w:tcPr>
           <w:p>
             <w:r>
-              <w:t>8</w:t>
+              <w:t>70%</w:t>
             </w:r>
           </w:p>
         </w:tc>
@@ -1541,7 +1354,7 @@
           </w:tcPr>
           <w:p>
             <w:r>
-              <w:t>44%</w:t>
+              <w:t>/catalog/poligrafiya/shirokoformatnaya-pechat/</w:t>
             </w:r>
           </w:p>
         </w:tc>
@@ -1563,7 +1376,7 @@
           </w:tcPr>
           <w:p>
             <w:r>
-              <w:t>20</w:t>
+              <w:t>15</w:t>
             </w:r>
           </w:p>
         </w:tc>
@@ -1573,7 +1386,7 @@
           </w:tcPr>
           <w:p>
             <w:r>
-              <w:t>7.2</w:t>
+              <w:t>14.0</w:t>
             </w:r>
           </w:p>
         </w:tc>
@@ -1583,7 +1396,7 @@
           </w:tcPr>
           <w:p>
             <w:r>
-              <w:t>8</w:t>
+              <w:t>60%</w:t>
             </w:r>
           </w:p>
         </w:tc>
@@ -1593,7 +1406,7 @@
           </w:tcPr>
           <w:p>
             <w:r>
-              <w:t>40%</w:t>
+              <w:t>/catalog/mobilnye-stendy/</w:t>
             </w:r>
           </w:p>
         </w:tc>
@@ -1605,7 +1418,7 @@
           </w:tcPr>
           <w:p>
             <w:r>
-              <w:t>Сувенирка/Мерч</w:t>
+              <w:t>Сувенирка и мерч</w:t>
             </w:r>
           </w:p>
         </w:tc>
@@ -1615,7 +1428,7 @@
           </w:tcPr>
           <w:p>
             <w:r>
-              <w:t>30</w:t>
+              <w:t>23</w:t>
             </w:r>
           </w:p>
         </w:tc>
@@ -1625,7 +1438,7 @@
           </w:tcPr>
           <w:p>
             <w:r>
-              <w:t>8.5</w:t>
+              <w:t>8.0</w:t>
             </w:r>
           </w:p>
         </w:tc>
@@ -1635,7 +1448,7 @@
           </w:tcPr>
           <w:p>
             <w:r>
-              <w:t>15</w:t>
+              <w:t>78%</w:t>
             </w:r>
           </w:p>
         </w:tc>
@@ -1645,7 +1458,7 @@
           </w:tcPr>
           <w:p>
             <w:r>
-              <w:t>33%</w:t>
+              <w:t>/catalog/suvenirnaya-produktsiya/</w:t>
             </w:r>
           </w:p>
         </w:tc>
@@ -1667,7 +1480,7 @@
           </w:tcPr>
           <w:p>
             <w:r>
-              <w:t>22</w:t>
+              <w:t>4</w:t>
             </w:r>
           </w:p>
         </w:tc>
@@ -1677,7 +1490,7 @@
           </w:tcPr>
           <w:p>
             <w:r>
-              <w:t>7.0</w:t>
+              <w:t>7.6</w:t>
             </w:r>
           </w:p>
         </w:tc>
@@ -1687,7 +1500,7 @@
           </w:tcPr>
           <w:p>
             <w:r>
-              <w:t>12</w:t>
+              <w:t>100%</w:t>
             </w:r>
           </w:p>
         </w:tc>
@@ -1697,169 +1510,23 @@
           </w:tcPr>
           <w:p>
             <w:r>
-              <w:t>65%</w:t>
-            </w:r>
-          </w:p>
-        </w:tc>
-      </w:tr>
-      <w:tr>
-        <w:tc>
-          <w:tcPr>
-            <w:tcW w:type="dxa" w:w="1728"/>
-          </w:tcPr>
-          <w:p>
-            <w:r>
-              <w:t>Информационные</w:t>
-            </w:r>
-          </w:p>
-        </w:tc>
-        <w:tc>
-          <w:tcPr>
-            <w:tcW w:type="dxa" w:w="1728"/>
-          </w:tcPr>
-          <w:p>
-            <w:r>
-              <w:t>150</w:t>
-            </w:r>
-          </w:p>
-        </w:tc>
-        <w:tc>
-          <w:tcPr>
-            <w:tcW w:type="dxa" w:w="1728"/>
-          </w:tcPr>
-          <w:p>
-            <w:r>
-              <w:t>12.0</w:t>
-            </w:r>
-          </w:p>
-        </w:tc>
-        <w:tc>
-          <w:tcPr>
-            <w:tcW w:type="dxa" w:w="1728"/>
-          </w:tcPr>
-          <w:p>
-            <w:r>
-              <w:t>8 статей</w:t>
-            </w:r>
-          </w:p>
-        </w:tc>
-        <w:tc>
-          <w:tcPr>
-            <w:tcW w:type="dxa" w:w="1728"/>
-          </w:tcPr>
-          <w:p>
-            <w:r>
-              <w:t>5%</w:t>
-            </w:r>
-          </w:p>
-        </w:tc>
-      </w:tr>
-      <w:tr>
-        <w:tc>
-          <w:tcPr>
-            <w:tcW w:type="dxa" w:w="1728"/>
-          </w:tcPr>
-          <w:p>
-            <w:r>
-              <w:t>Сравнения</w:t>
-            </w:r>
-          </w:p>
-        </w:tc>
-        <w:tc>
-          <w:tcPr>
-            <w:tcW w:type="dxa" w:w="1728"/>
-          </w:tcPr>
-          <w:p>
-            <w:r>
-              <w:t>15</w:t>
-            </w:r>
-          </w:p>
-        </w:tc>
-        <w:tc>
-          <w:tcPr>
-            <w:tcW w:type="dxa" w:w="1728"/>
-          </w:tcPr>
-          <w:p>
-            <w:r>
-              <w:t>—</w:t>
-            </w:r>
-          </w:p>
-        </w:tc>
-        <w:tc>
-          <w:tcPr>
-            <w:tcW w:type="dxa" w:w="1728"/>
-          </w:tcPr>
-          <w:p>
-            <w:r>
-              <w:t>0</w:t>
-            </w:r>
-          </w:p>
-        </w:tc>
-        <w:tc>
-          <w:tcPr>
-            <w:tcW w:type="dxa" w:w="1728"/>
-          </w:tcPr>
-          <w:p>
-            <w:r>
-              <w:t>0%</w:t>
-            </w:r>
-          </w:p>
-        </w:tc>
-      </w:tr>
-      <w:tr>
-        <w:tc>
-          <w:tcPr>
-            <w:tcW w:type="dxa" w:w="1728"/>
-          </w:tcPr>
-          <w:p>
-            <w:r>
-              <w:t>Локальные</w:t>
-            </w:r>
-          </w:p>
-        </w:tc>
-        <w:tc>
-          <w:tcPr>
-            <w:tcW w:type="dxa" w:w="1728"/>
-          </w:tcPr>
-          <w:p>
-            <w:r>
-              <w:t>20</w:t>
-            </w:r>
-          </w:p>
-        </w:tc>
-        <w:tc>
-          <w:tcPr>
-            <w:tcW w:type="dxa" w:w="1728"/>
-          </w:tcPr>
-          <w:p>
-            <w:r>
-              <w:t>—</w:t>
-            </w:r>
-          </w:p>
-        </w:tc>
-        <w:tc>
-          <w:tcPr>
-            <w:tcW w:type="dxa" w:w="1728"/>
-          </w:tcPr>
-          <w:p>
-            <w:r>
-              <w:t>0</w:t>
-            </w:r>
-          </w:p>
-        </w:tc>
-        <w:tc>
-          <w:tcPr>
-            <w:tcW w:type="dxa" w:w="1728"/>
-          </w:tcPr>
-          <w:p>
-            <w:r>
-              <w:t>0%</w:t>
+              <w:t>/inzhenernaya-pechat/</w:t>
             </w:r>
           </w:p>
         </w:tc>
       </w:tr>
     </w:tbl>
     <w:p/>
+    <w:p>
+      <w:r>
+        <w:t>Календари и мобильные стенды просели: средняя позиция выше 13, значит по ним нужны</w:t>
+      </w:r>
+    </w:p>
+    <w:p>
+      <w:r>
+        <w:t>отдельные страницы и работа с внутренними ссылками, а не только заголовки.</w:t>
+      </w:r>
+    </w:p>
     <w:p>
       <w:pPr>
         <w:spacing w:after="40"/>
@@ -4047,7 +3714,7 @@
           </w:tcPr>
           <w:p>
             <w:r>
-              <w:t>32 726 (25 134 посетителей, отказы 71%, глубина 1.8)</w:t>
+              <w:t>32 730 (25 137 посетителей, отказы 71%, глубина 1.8)</w:t>
             </w:r>
           </w:p>
         </w:tc>
@@ -4143,7 +3810,7 @@
           </w:tcPr>
           <w:p>
             <w:r>
-              <w:t>510 из 32 726 просмотров</w:t>
+              <w:t>510 из 32 730 просмотров</w:t>
             </w:r>
           </w:p>
         </w:tc>

</xml_diff>